<commit_message>
Add bookmark for abstract
</commit_message>
<xml_diff>
--- a/inst/csas-docx/resdoc-frontmatter-english2.docx
+++ b/inst/csas-docx/resdoc-frontmatter-english2.docx
@@ -281,12 +281,14 @@
         </w:rPr>
         <w:t xml:space="preserve">DOI: </w:t>
       </w:r>
+      <w:proofErr w:type="spellStart"/>
       <w:r>
         <w:rPr>
           <w:color w:val="4F81BD" w:themeColor="accent1"/>
         </w:rPr>
         <w:t>xxx.xxx.xxx</w:t>
       </w:r>
+      <w:proofErr w:type="spellEnd"/>
     </w:p>
     <w:p>
       <w:pPr>
@@ -464,6 +466,7 @@
         </w:rPr>
         <w:t>/</w:t>
       </w:r>
+      <w:proofErr w:type="spellStart"/>
       <w:r>
         <w:rPr>
           <w:color w:val="4F81BD" w:themeColor="accent1"/>
@@ -471,6 +474,7 @@
         </w:rPr>
         <w:t>nnn</w:t>
       </w:r>
+      <w:proofErr w:type="spellEnd"/>
       <w:r>
         <w:rPr>
           <w:lang w:val="en-US"/>
@@ -521,21 +525,39 @@
         <w:t xml:space="preserve"> </w:t>
       </w:r>
       <w:bookmarkStart w:id="9" w:name="_Hlk215580570"/>
+      <w:proofErr w:type="spellStart"/>
       <w:r>
         <w:rPr>
           <w:color w:val="000000" w:themeColor="text1"/>
           <w:lang w:val="en-US"/>
         </w:rPr>
-        <w:t>doi:</w:t>
+        <w:t>doi</w:t>
+      </w:r>
+      <w:proofErr w:type="spellEnd"/>
+      <w:r>
+        <w:rPr>
+          <w:color w:val="000000" w:themeColor="text1"/>
+          <w:lang w:val="en-US"/>
+        </w:rPr>
+        <w:t>:</w:t>
       </w:r>
       <w:r>
         <w:rPr>
           <w:color w:val="4F81BD" w:themeColor="accent1"/>
           <w:lang w:val="en-US"/>
         </w:rPr>
-        <w:t xml:space="preserve"> xxx.xxx.xxx</w:t>
+        <w:t xml:space="preserve"> </w:t>
+      </w:r>
+      <w:proofErr w:type="spellStart"/>
+      <w:r>
+        <w:rPr>
+          <w:color w:val="4F81BD" w:themeColor="accent1"/>
+          <w:lang w:val="en-US"/>
+        </w:rPr>
+        <w:t>xxx.xxx.xxx</w:t>
       </w:r>
       <w:bookmarkEnd w:id="9"/>
+      <w:proofErr w:type="spellEnd"/>
     </w:p>
     <w:p>
       <w:pPr>
@@ -665,6 +687,7 @@
         </w:rPr>
         <w:t xml:space="preserve">. </w:t>
       </w:r>
+      <w:proofErr w:type="spellStart"/>
       <w:r>
         <w:rPr>
           <w:lang w:val="fr-CA"/>
@@ -675,25 +698,60 @@
         <w:rPr>
           <w:lang w:val="fr-CA"/>
         </w:rPr>
-        <w:t>r. can. de</w:t>
-      </w:r>
+        <w:t>r</w:t>
+      </w:r>
+      <w:proofErr w:type="spellEnd"/>
       <w:r>
         <w:rPr>
           <w:lang w:val="fr-CA"/>
         </w:rPr>
+        <w:t>. can. de</w:t>
+      </w:r>
+      <w:r>
+        <w:rPr>
+          <w:lang w:val="fr-CA"/>
+        </w:rPr>
         <w:t>s avis</w:t>
       </w:r>
       <w:r>
         <w:rPr>
           <w:lang w:val="fr-CA"/>
         </w:rPr>
-        <w:t xml:space="preserve"> sci. du MPO.</w:t>
-      </w:r>
+        <w:t xml:space="preserve"> </w:t>
+      </w:r>
+      <w:proofErr w:type="spellStart"/>
       <w:r>
         <w:rPr>
           <w:lang w:val="fr-CA"/>
         </w:rPr>
-        <w:t xml:space="preserve"> Doc. de rech. </w:t>
+        <w:t>sci</w:t>
+      </w:r>
+      <w:proofErr w:type="spellEnd"/>
+      <w:r>
+        <w:rPr>
+          <w:lang w:val="fr-CA"/>
+        </w:rPr>
+        <w:t>. du MPO.</w:t>
+      </w:r>
+      <w:r>
+        <w:rPr>
+          <w:lang w:val="fr-CA"/>
+        </w:rPr>
+        <w:t xml:space="preserve"> Doc. de </w:t>
+      </w:r>
+      <w:proofErr w:type="spellStart"/>
+      <w:r>
+        <w:rPr>
+          <w:lang w:val="fr-CA"/>
+        </w:rPr>
+        <w:t>rech</w:t>
+      </w:r>
+      <w:proofErr w:type="spellEnd"/>
+      <w:r>
+        <w:rPr>
+          <w:lang w:val="fr-CA"/>
+        </w:rPr>
+        <w:t xml:space="preserve">. </w:t>
       </w:r>
       <w:bookmarkStart w:id="13" w:name="year_french_reference"/>
       <w:r>
@@ -715,6 +773,7 @@
         </w:rPr>
         <w:t>/</w:t>
       </w:r>
+      <w:proofErr w:type="spellStart"/>
       <w:r>
         <w:rPr>
           <w:color w:val="4F81BD" w:themeColor="accent1"/>
@@ -722,6 +781,7 @@
         </w:rPr>
         <w:t>nnn</w:t>
       </w:r>
+      <w:proofErr w:type="spellEnd"/>
       <w:r>
         <w:rPr>
           <w:lang w:val="en-US"/>
@@ -803,6 +863,11 @@
       <w:pPr>
         <w:pStyle w:val="BodyText"/>
       </w:pPr>
+      <w:bookmarkStart w:id="15" w:name="abstract"/>
+      <w:r>
+        <w:t>[Abstract]</w:t>
+      </w:r>
+      <w:bookmarkEnd w:id="15"/>
     </w:p>
     <w:p>
       <w:pPr>
@@ -1147,8 +1212,13 @@
     </w:r>
     <w:bookmarkEnd w:id="3"/>
     <w:r>
-      <w:t>/nnn</w:t>
+      <w:t>/</w:t>
     </w:r>
+    <w:proofErr w:type="spellStart"/>
+    <w:r>
+      <w:t>nnn</w:t>
+    </w:r>
+    <w:proofErr w:type="spellEnd"/>
   </w:p>
   <w:p>
     <w:pPr>
@@ -5621,20 +5691,7 @@
 </file>
 
 <file path=customXml/item1.xml><?xml version="1.0" encoding="utf-8"?>
-<p:properties xmlns:p="http://schemas.microsoft.com/office/2006/metadata/properties" xmlns:xsi="http://www.w3.org/2001/XMLSchema-instance" xmlns:pc="http://schemas.microsoft.com/office/infopath/2007/PartnerControls">
-  <documentManagement>
-    <Status xmlns="92d68da2-9c2d-44ac-ae06-3f4a753b389d" xsi:nil="true"/>
-    <test xmlns="92d68da2-9c2d-44ac-ae06-3f4a753b389d" xsi:nil="true"/>
-    <DocumentType xmlns="92d68da2-9c2d-44ac-ae06-3f4a753b389d" xsi:nil="true"/>
-    <lcf76f155ced4ddcb4097134ff3c332f xmlns="92d68da2-9c2d-44ac-ae06-3f4a753b389d">
-      <Terms xmlns="http://schemas.microsoft.com/office/infopath/2007/PartnerControls"/>
-    </lcf76f155ced4ddcb4097134ff3c332f>
-    <Region xmlns="92d68da2-9c2d-44ac-ae06-3f4a753b389d" xsi:nil="true"/>
-    <TaxCatchAll xmlns="af38042d-bccf-41a5-8261-f25f76403ccf" xsi:nil="true"/>
-    <_ip_UnifiedCompliancePolicyUIAction xmlns="http://schemas.microsoft.com/sharepoint/v3" xsi:nil="true"/>
-    <_ip_UnifiedCompliancePolicyProperties xmlns="http://schemas.microsoft.com/sharepoint/v3" xsi:nil="true"/>
-  </documentManagement>
-</p:properties>
+<b:Sources xmlns:b="http://schemas.openxmlformats.org/officeDocument/2006/bibliography" xmlns="http://schemas.openxmlformats.org/officeDocument/2006/bibliography" SelectedStyle="\APA.XSL" StyleName="APA"/>
 </file>
 
 <file path=customXml/item2.xml><?xml version="1.0" encoding="utf-8"?>
@@ -5926,7 +5983,20 @@
 </file>
 
 <file path=customXml/item3.xml><?xml version="1.0" encoding="utf-8"?>
-<b:Sources xmlns:b="http://schemas.openxmlformats.org/officeDocument/2006/bibliography" xmlns="http://schemas.openxmlformats.org/officeDocument/2006/bibliography" SelectedStyle="\APA.XSL" StyleName="APA"/>
+<p:properties xmlns:p="http://schemas.microsoft.com/office/2006/metadata/properties" xmlns:xsi="http://www.w3.org/2001/XMLSchema-instance" xmlns:pc="http://schemas.microsoft.com/office/infopath/2007/PartnerControls">
+  <documentManagement>
+    <Status xmlns="92d68da2-9c2d-44ac-ae06-3f4a753b389d" xsi:nil="true"/>
+    <test xmlns="92d68da2-9c2d-44ac-ae06-3f4a753b389d" xsi:nil="true"/>
+    <DocumentType xmlns="92d68da2-9c2d-44ac-ae06-3f4a753b389d" xsi:nil="true"/>
+    <lcf76f155ced4ddcb4097134ff3c332f xmlns="92d68da2-9c2d-44ac-ae06-3f4a753b389d">
+      <Terms xmlns="http://schemas.microsoft.com/office/infopath/2007/PartnerControls"/>
+    </lcf76f155ced4ddcb4097134ff3c332f>
+    <Region xmlns="92d68da2-9c2d-44ac-ae06-3f4a753b389d" xsi:nil="true"/>
+    <TaxCatchAll xmlns="af38042d-bccf-41a5-8261-f25f76403ccf" xsi:nil="true"/>
+    <_ip_UnifiedCompliancePolicyUIAction xmlns="http://schemas.microsoft.com/sharepoint/v3" xsi:nil="true"/>
+    <_ip_UnifiedCompliancePolicyProperties xmlns="http://schemas.microsoft.com/sharepoint/v3" xsi:nil="true"/>
+  </documentManagement>
+</p:properties>
 </file>
 
 <file path=customXml/item4.xml><?xml version="1.0" encoding="utf-8"?>
@@ -5939,13 +6009,9 @@
 </file>
 
 <file path=customXml/itemProps1.xml><?xml version="1.0" encoding="utf-8"?>
-<ds:datastoreItem xmlns:ds="http://schemas.openxmlformats.org/officeDocument/2006/customXml" ds:itemID="{33CE347D-96AD-4E2E-BFB0-11DB1E96F7C8}">
+<ds:datastoreItem xmlns:ds="http://schemas.openxmlformats.org/officeDocument/2006/customXml" ds:itemID="{8FD2BDE5-F1D6-40ED-BAF2-EE487A17D0B1}">
   <ds:schemaRefs>
-    <ds:schemaRef ds:uri="http://schemas.microsoft.com/office/2006/metadata/properties"/>
-    <ds:schemaRef ds:uri="http://schemas.microsoft.com/office/infopath/2007/PartnerControls"/>
-    <ds:schemaRef ds:uri="92d68da2-9c2d-44ac-ae06-3f4a753b389d"/>
-    <ds:schemaRef ds:uri="af38042d-bccf-41a5-8261-f25f76403ccf"/>
-    <ds:schemaRef ds:uri="http://schemas.microsoft.com/sharepoint/v3"/>
+    <ds:schemaRef ds:uri="http://schemas.openxmlformats.org/officeDocument/2006/bibliography"/>
   </ds:schemaRefs>
 </ds:datastoreItem>
 </file>
@@ -5971,9 +6037,13 @@
 </file>
 
 <file path=customXml/itemProps3.xml><?xml version="1.0" encoding="utf-8"?>
-<ds:datastoreItem xmlns:ds="http://schemas.openxmlformats.org/officeDocument/2006/customXml" ds:itemID="{8FD2BDE5-F1D6-40ED-BAF2-EE487A17D0B1}">
+<ds:datastoreItem xmlns:ds="http://schemas.openxmlformats.org/officeDocument/2006/customXml" ds:itemID="{33CE347D-96AD-4E2E-BFB0-11DB1E96F7C8}">
   <ds:schemaRefs>
-    <ds:schemaRef ds:uri="http://schemas.openxmlformats.org/officeDocument/2006/bibliography"/>
+    <ds:schemaRef ds:uri="http://schemas.microsoft.com/office/2006/metadata/properties"/>
+    <ds:schemaRef ds:uri="http://schemas.microsoft.com/office/infopath/2007/PartnerControls"/>
+    <ds:schemaRef ds:uri="92d68da2-9c2d-44ac-ae06-3f4a753b389d"/>
+    <ds:schemaRef ds:uri="af38042d-bccf-41a5-8261-f25f76403ccf"/>
+    <ds:schemaRef ds:uri="http://schemas.microsoft.com/sharepoint/v3"/>
   </ds:schemaRefs>
 </ds:datastoreItem>
 </file>

</xml_diff>